<commit_message>
Update selected topic wording
</commit_message>
<xml_diff>
--- a/reports/Доклад_защита.docx
+++ b/reports/Доклад_защита.docx
@@ -31,7 +31,7 @@
         <w:rPr>
           <w:lang w:val="ru-RU"/>
         </w:rPr>
-        <w:t xml:space="preserve">Здравствуйте. В работе я решал две задачи машинного обучения: классификацию и кластеризацию. В исходном примере задания говорилось про атаки, но в выданных файлах находился датасет </w:t>
+        <w:t xml:space="preserve">Здравствуйте. В работе я решал две задачи машинного обучения: классификацию и кластеризацию. В качестве темы была выбрана задача анализа данных </w:t>
       </w:r>
       <w:r>
         <w:t>DASS</w:t>
@@ -40,13 +40,7 @@
         <w:rPr>
           <w:lang w:val="ru-RU"/>
         </w:rPr>
-        <w:t xml:space="preserve">-42, поэтому я адаптировал задачу под </w:t>
-      </w:r>
-      <w:r>
-        <w:rPr>
-          <w:lang w:val="ru-RU"/>
-        </w:rPr>
-        <w:t>реальные данные.</w:t>
+        <w:t>-42, связанных с оценкой уровней депрессии, тревожности и стресса.</w:t>
       </w:r>
     </w:p>
     <w:p>
@@ -60,7 +54,35 @@
         <w:rPr>
           <w:lang w:val="ru-RU"/>
         </w:rPr>
-        <w:t>Прикладная область связана с анализом анкетных данных, отражающих уровень депрессии, тревожности и стресса. Объектом является респондент, а признаками — его числовые ответы на вопросы анкеты и дополнительные параметры.</w:t>
+        <w:t xml:space="preserve">Прикладная область связана с анализом анкетных данных, отражающих психологическое состояние человека. Объектом является респондент, а признаками — его числовые ответы на вопросы анкеты и дополнительные параметры. Такой </w:t>
+      </w:r>
+      <w:proofErr w:type="spellStart"/>
+      <w:r>
+        <w:rPr>
+          <w:lang w:val="ru-RU"/>
+        </w:rPr>
+        <w:t>датасет</w:t>
+      </w:r>
+      <w:proofErr w:type="spellEnd"/>
+      <w:r>
+        <w:rPr>
+          <w:lang w:val="ru-RU"/>
+        </w:rPr>
+        <w:t xml:space="preserve"> подходит для доработки модели, потому что содержит несколько классов и позволяет перейти от бинарного подхода к </w:t>
+      </w:r>
+      <w:proofErr w:type="spellStart"/>
+      <w:r>
+        <w:rPr>
+          <w:lang w:val="ru-RU"/>
+        </w:rPr>
+        <w:t>многоклассовому</w:t>
+      </w:r>
+      <w:proofErr w:type="spellEnd"/>
+      <w:r>
+        <w:rPr>
+          <w:lang w:val="ru-RU"/>
+        </w:rPr>
+        <w:t>.</w:t>
       </w:r>
     </w:p>
     <w:p>
@@ -74,13 +96,7 @@
         <w:rPr>
           <w:lang w:val="ru-RU"/>
         </w:rPr>
-        <w:t>Сначала я выполнил к</w:t>
-      </w:r>
-      <w:r>
-        <w:rPr>
-          <w:lang w:val="ru-RU"/>
-        </w:rPr>
-        <w:t xml:space="preserve">лассификацию. Модель должна была определить один из пяти классов: норма, лёгкий, умеренный, тяжёлый или крайне тяжёлый уровень. Для этого использовался </w:t>
+        <w:t xml:space="preserve">Сначала я выполнил классификацию. Модель была доработана до определения пяти классов: норма, лёгкий, умеренный, тяжёлый или крайне тяжёлый уровень. Для этого использовался </w:t>
       </w:r>
       <w:r>
         <w:t>Random</w:t>
@@ -121,13 +137,7 @@
         <w:rPr>
           <w:lang w:val="ru-RU"/>
         </w:rPr>
-        <w:t>Модель показала точность 90,26 %. Это хороший результат, потому что примерно в</w:t>
-      </w:r>
-      <w:r>
-        <w:rPr>
-          <w:lang w:val="ru-RU"/>
-        </w:rPr>
-        <w:t xml:space="preserve"> 90 случаях из 100 класс определяется правильно. Дополнительно была построена матрица ошибок и график важности признаков.</w:t>
+        <w:t>Модель показала точность 90,26 %. Это хороший результат, потому что примерно в 90 случаях из 100 класс определяется правильно. Дополнительно была построена матрица ошибок и график важности признаков.</w:t>
       </w:r>
     </w:p>
     <w:p>
@@ -231,13 +241,7 @@
         <w:rPr>
           <w:lang w:val="ru-RU"/>
         </w:rPr>
-        <w:t>. Именно они сильнее всего повлияли на решен</w:t>
-      </w:r>
-      <w:r>
-        <w:rPr>
-          <w:lang w:val="ru-RU"/>
-        </w:rPr>
-        <w:t>ие модели.</w:t>
+        <w:t>. Именно они сильнее всего повлияли на решение модели.</w:t>
       </w:r>
     </w:p>
     <w:p>
@@ -301,13 +305,7 @@
         <w:rPr>
           <w:lang w:val="ru-RU"/>
         </w:rPr>
-        <w:t>Для сравнения с реальными пятью к</w:t>
-      </w:r>
-      <w:r>
-        <w:rPr>
-          <w:lang w:val="ru-RU"/>
-        </w:rPr>
-        <w:t xml:space="preserve">лассами была рассчитана </w:t>
+        <w:t xml:space="preserve">Для сравнения с реальными пятью классами была рассчитана </w:t>
       </w:r>
       <w:r>
         <w:t>purity</w:t>
@@ -330,114 +328,8 @@
         <w:rPr>
           <w:lang w:val="ru-RU"/>
         </w:rPr>
-        <w:t>Вывод: классификация показала лучший результат, потому что обучалась на размеченных данных. Кластеризация тоже полезна, но она бол</w:t>
-      </w:r>
-      <w:r>
-        <w:rPr>
-          <w:lang w:val="ru-RU"/>
-        </w:rPr>
-        <w:t>ьше подходит для поиска общей структуры данных, а не для точного определения класса.</w:t>
-      </w:r>
-    </w:p>
-    <w:p>
-      <w:pPr>
-        <w:pStyle w:val="1"/>
-        <w:jc w:val="left"/>
-        <w:rPr>
-          <w:lang w:val="ru-RU"/>
-        </w:rPr>
-      </w:pPr>
-      <w:r>
-        <w:rPr>
-          <w:rFonts w:ascii="Times New Roman" w:eastAsia="Times New Roman" w:hAnsi="Times New Roman"/>
-          <w:lang w:val="ru-RU"/>
-        </w:rPr>
         <w:lastRenderedPageBreak/>
-        <w:t>Короткие ответы на вопросы</w:t>
-      </w:r>
-    </w:p>
-    <w:p>
-      <w:pPr>
-        <w:spacing w:after="60"/>
-        <w:rPr>
-          <w:lang w:val="ru-RU"/>
-        </w:rPr>
-      </w:pPr>
-      <w:r>
-        <w:rPr>
-          <w:lang w:val="ru-RU"/>
-        </w:rPr>
-        <w:t>Почему выбран этот датасет? Он был в исходных файлах и подходит для машинного обучения: содержит много объектов, числовые признаки и несколько к</w:t>
-      </w:r>
-      <w:r>
-        <w:rPr>
-          <w:lang w:val="ru-RU"/>
-        </w:rPr>
-        <w:t>лассов.</w:t>
-      </w:r>
-    </w:p>
-    <w:p>
-      <w:pPr>
-        <w:spacing w:after="60"/>
-        <w:rPr>
-          <w:lang w:val="ru-RU"/>
-        </w:rPr>
-      </w:pPr>
-      <w:r>
-        <w:rPr>
-          <w:lang w:val="ru-RU"/>
-        </w:rPr>
-        <w:t xml:space="preserve">Почему не атаки? Потому что атаки были примером в формулировке, а фактически выданный датасет — </w:t>
-      </w:r>
-      <w:r>
-        <w:t>DASS</w:t>
-      </w:r>
-      <w:r>
-        <w:rPr>
-          <w:lang w:val="ru-RU"/>
-        </w:rPr>
-        <w:t>-42.</w:t>
-      </w:r>
-    </w:p>
-    <w:p>
-      <w:pPr>
-        <w:spacing w:after="60"/>
-        <w:rPr>
-          <w:lang w:val="ru-RU"/>
-        </w:rPr>
-      </w:pPr>
-      <w:r>
-        <w:rPr>
-          <w:lang w:val="ru-RU"/>
-        </w:rPr>
-        <w:t xml:space="preserve">Почему модель хорошая? Она показала </w:t>
-      </w:r>
-      <w:r>
-        <w:t>accuracy</w:t>
-      </w:r>
-      <w:r>
-        <w:rPr>
-          <w:lang w:val="ru-RU"/>
-        </w:rPr>
-        <w:t xml:space="preserve"> 0,9026 и </w:t>
-      </w:r>
-      <w:r>
-        <w:t>F</w:t>
-      </w:r>
-      <w:r>
-        <w:rPr>
-          <w:lang w:val="ru-RU"/>
-        </w:rPr>
-        <w:t xml:space="preserve">1 </w:t>
-      </w:r>
-      <w:r>
-        <w:t>weighted</w:t>
-      </w:r>
-      <w:r>
-        <w:rPr>
-          <w:lang w:val="ru-RU"/>
-        </w:rPr>
-        <w:t xml:space="preserve"> 0,8999, а ошибки в основном возникают между близкими классами.</w:t>
+        <w:t>Вывод: классификация показала лучший результат, потому что обучалась на размеченных данных. Кластеризация тоже полезна, но она больше подходит для поиска общей структуры данных, а не для точного определения класса.</w:t>
       </w:r>
     </w:p>
     <w:sectPr>
@@ -938,11 +830,6 @@
     <w:lsdException w:name="Book Title" w:uiPriority="33" w:qFormat="1"/>
     <w:lsdException w:name="Bibliography" w:semiHidden="1" w:uiPriority="37" w:unhideWhenUsed="1"/>
     <w:lsdException w:name="TOC Heading" w:semiHidden="1" w:uiPriority="39" w:unhideWhenUsed="1" w:qFormat="1"/>
-    <w:lsdException w:name="Plain Table 5" w:semiHidden="1" w:unhideWhenUsed="1"/>
-    <w:lsdException w:name="Grid Table Light" w:semiHidden="1" w:unhideWhenUsed="1"/>
-    <w:lsdException w:name="Grid Table 1 Light" w:semiHidden="1" w:unhideWhenUsed="1"/>
-    <w:lsdException w:name="Grid Table 2" w:semiHidden="1" w:unhideWhenUsed="1"/>
-    <w:lsdException w:name="Grid Table 3" w:semiHidden="1" w:unhideWhenUsed="1"/>
     <w:lsdException w:name="Grid Table 4" w:uiPriority="49"/>
     <w:lsdException w:name="Grid Table 5 Dark" w:uiPriority="50"/>
     <w:lsdException w:name="Grid Table 6 Colorful" w:uiPriority="51"/>

</xml_diff>